<commit_message>
update Đăng ký/Huỷ đăng ký học phần
</commit_message>
<xml_diff>
--- a/text.docx
+++ b/text.docx
@@ -338,7 +338,79 @@
           <w:szCs w:val="20"/>
         </w:rPr>
         <w:lastRenderedPageBreak/>
-        <w:t>php artisan queue:work --queue=registration,default</w:t>
+        <w:t>php artisan queue:work redis --queue=registration</w:t>
+      </w:r>
+    </w:p>
+    <w:p>
+      <w:pPr>
+        <w:pStyle w:val="NormalWeb"/>
+        <w:rPr>
+          <w:rFonts w:ascii="Courier New" w:hAnsi="Courier New" w:cs="Courier New"/>
+          <w:sz w:val="20"/>
+          <w:szCs w:val="20"/>
+          <w:highlight w:val="green"/>
+        </w:rPr>
+      </w:pPr>
+      <w:bookmarkStart w:id="0" w:name="_GoBack"/>
+      <w:bookmarkEnd w:id="0"/>
+      <w:r>
+        <w:rPr>
+          <w:rFonts w:ascii="Courier New" w:hAnsi="Courier New" w:cs="Courier New"/>
+          <w:sz w:val="20"/>
+          <w:szCs w:val="20"/>
+          <w:highlight w:val="green"/>
+        </w:rPr>
+        <w:t>"E:\redis\redis-cli.exe" // chạy sever redis thủ công</w:t>
+      </w:r>
+      <w:r>
+        <w:rPr>
+          <w:rFonts w:ascii="Courier New" w:hAnsi="Courier New" w:cs="Courier New"/>
+          <w:sz w:val="20"/>
+          <w:szCs w:val="20"/>
+          <w:highlight w:val="green"/>
+        </w:rPr>
+        <w:t xml:space="preserve"> </w:t>
+      </w:r>
+    </w:p>
+    <w:p>
+      <w:pPr>
+        <w:pStyle w:val="NormalWeb"/>
+        <w:rPr>
+          <w:rFonts w:ascii="Courier New" w:hAnsi="Courier New" w:cs="Courier New"/>
+          <w:sz w:val="20"/>
+          <w:szCs w:val="20"/>
+          <w:highlight w:val="green"/>
+        </w:rPr>
+      </w:pPr>
+      <w:r>
+        <w:rPr>
+          <w:rFonts w:ascii="Courier New" w:hAnsi="Courier New" w:cs="Courier New"/>
+          <w:sz w:val="20"/>
+          <w:szCs w:val="20"/>
+          <w:highlight w:val="green"/>
+        </w:rPr>
+        <w:tab/>
+        <w:t>set truonghoc-database-lophocphan:11:slots 50</w:t>
+      </w:r>
+    </w:p>
+    <w:p>
+      <w:pPr>
+        <w:pStyle w:val="NormalWeb"/>
+        <w:rPr>
+          <w:rFonts w:ascii="Courier New" w:hAnsi="Courier New" w:cs="Courier New"/>
+          <w:sz w:val="20"/>
+          <w:szCs w:val="20"/>
+        </w:rPr>
+      </w:pPr>
+      <w:r>
+        <w:rPr>
+          <w:rFonts w:ascii="Courier New" w:hAnsi="Courier New" w:cs="Courier New"/>
+          <w:sz w:val="20"/>
+          <w:szCs w:val="20"/>
+          <w:highlight w:val="green"/>
+        </w:rPr>
+        <w:tab/>
+        <w:t>get truonghoc-database-lophocphan:11:slots</w:t>
       </w:r>
     </w:p>
     <w:p>
@@ -602,8 +674,6 @@
           <w:szCs w:val="20"/>
         </w:rPr>
       </w:pPr>
-      <w:bookmarkStart w:id="0" w:name="_GoBack"/>
-      <w:bookmarkEnd w:id="0"/>
     </w:p>
     <w:p>
       <w:pPr>
@@ -1057,6 +1127,7 @@
           <w:rFonts w:eastAsia="Times New Roman" w:cs="Times New Roman"/>
           <w:szCs w:val="24"/>
         </w:rPr>
+        <w:lastRenderedPageBreak/>
         <w:t>Hoặc dùng CMD:</w:t>
       </w:r>
     </w:p>
@@ -1114,7 +1185,6 @@
           <w:sz w:val="20"/>
           <w:szCs w:val="20"/>
         </w:rPr>
-        <w:lastRenderedPageBreak/>
         <w:t>:</w:t>
       </w:r>
       <w:r>
@@ -11146,6 +11216,7 @@
   <w:style w:type="character" w:default="1" w:styleId="DefaultParagraphFont">
     <w:name w:val="Default Paragraph Font"/>
     <w:uiPriority w:val="1"/>
+    <w:semiHidden/>
     <w:unhideWhenUsed/>
   </w:style>
   <w:style w:type="table" w:default="1" w:styleId="TableNormal">
@@ -11638,7 +11709,7 @@
 </file>
 
 <file path=customXml/itemProps1.xml><?xml version="1.0" encoding="utf-8"?>
-<ds:datastoreItem xmlns:ds="http://schemas.openxmlformats.org/officeDocument/2006/customXml" ds:itemID="{BB61B881-17CF-4EB7-8E98-0874906AF220}">
+<ds:datastoreItem xmlns:ds="http://schemas.openxmlformats.org/officeDocument/2006/customXml" ds:itemID="{DE51E871-D1CE-4E2F-BD9E-A9AF6A179C2F}">
   <ds:schemaRefs>
     <ds:schemaRef ds:uri="http://schemas.openxmlformats.org/officeDocument/2006/bibliography"/>
   </ds:schemaRefs>

</xml_diff>